<commit_message>
Refactor Docker Compose configurations and update lab guides
- Updated docker-compose.yml files for Day 06, Day 07, Day 08, and Day 09 to improve Kafka and MinIO configurations.
- Enhanced Airflow setup in Day 08 with common environment variables and initialization steps.
- Added new Python scripts for Day 06 and Day 07 to provide runnable equivalents for lab tasks.
- Improved the medallion pipeline in Day 08 by replacing pandas with SQLAlchemy for database interactions.
- Adjusted producer and streams_app scripts in Day 09 to enhance functionality and usability.
- Updated lab guides for Days 06, 07, 08, and 09 to reflect changes in the code and configurations.
</commit_message>
<xml_diff>
--- a/Week_02/Day_06/Lab/Day_06_Lab_Guide.docx
+++ b/Week_02/Day_06/Lab/Day_06_Lab_Guide.docx
@@ -5,14 +5,22 @@
     <w:p>
       <w:pPr>
         <w:pStyle w:val="Title"/>
+        <w:jc w:val="center"/>
       </w:pPr>
       <w:r>
         <w:t>Day 6 Lab Instructions</w:t>
       </w:r>
     </w:p>
     <w:p>
+      <w:pPr>
+        <w:jc w:val="center"/>
+      </w:pPr>
       <w:r>
-        <w:t>Data Transformation with Apache Hop</w:t>
+        <w:rPr>
+          <w:b/>
+          <w:sz w:val="28"/>
+        </w:rPr>
+        <w:t>Data Transformation with Apache Hop, Kafka, and Docker</w:t>
       </w:r>
     </w:p>
     <w:p>
@@ -20,15 +28,385 @@
         <w:pStyle w:val="Heading1"/>
       </w:pPr>
       <w:r>
-        <w:t>Lab Overview</w:t>
+        <w:t>Lab Outcome</w:t>
+      </w:r>
+    </w:p>
+    <w:p>
+      <w:r>
+        <w:t>Build and verify Day 6 data transformation exercises using Apache Hop Web, Kafka, Schema Registry, Kafka UI, and runnable validation scripts. This guide now includes real Ubuntu desktop screenshots captured with gnome-screenshot.</w:t>
+      </w:r>
+    </w:p>
+    <w:tbl>
+      <w:tblPr>
+        <w:tblW w:type="auto" w:w="0"/>
+        <w:tblLook w:firstColumn="1" w:firstRow="1" w:lastColumn="0" w:lastRow="0" w:noHBand="0" w:noVBand="1" w:val="04A0"/>
+      </w:tblPr>
+      <w:tblGrid>
+        <w:gridCol w:w="10368"/>
+      </w:tblGrid>
+      <w:tr>
+        <w:tc>
+          <w:tcPr>
+            <w:tcW w:type="dxa" w:w="10368"/>
+            <w:shd w:fill="EAF7EE"/>
+          </w:tcPr>
+          <w:p>
+            <w:r>
+              <w:rPr>
+                <w:b/>
+              </w:rPr>
+              <w:t xml:space="preserve">Screenshot evidence: </w:t>
+            </w:r>
+            <w:r>
+              <w:t>The screenshots in this document are actual desktop captures from the running Ubuntu session, not generated mockups.</w:t>
+            </w:r>
+          </w:p>
+        </w:tc>
+      </w:tr>
+    </w:tbl>
+    <w:p/>
+    <w:p>
+      <w:pPr>
+        <w:pStyle w:val="Heading1"/>
+      </w:pPr>
+      <w:r>
+        <w:t>Required Services and Ports</w:t>
+      </w:r>
+    </w:p>
+    <w:tbl>
+      <w:tblPr>
+        <w:tblStyle w:val="TableGrid"/>
+        <w:tblW w:type="auto" w:w="0"/>
+        <w:jc w:val="center"/>
+        <w:tblLook w:firstColumn="1" w:firstRow="1" w:lastColumn="0" w:lastRow="0" w:noHBand="0" w:noVBand="1" w:val="04A0"/>
+      </w:tblPr>
+      <w:tblGrid>
+        <w:gridCol w:w="3456"/>
+        <w:gridCol w:w="3456"/>
+        <w:gridCol w:w="3456"/>
+      </w:tblGrid>
+      <w:tr>
+        <w:tc>
+          <w:tcPr>
+            <w:tcW w:type="dxa" w:w="3456"/>
+            <w:shd w:fill="D9EAF7"/>
+            <w:vAlign w:val="top"/>
+          </w:tcPr>
+          <w:p>
+            <w:r>
+              <w:t>Component</w:t>
+            </w:r>
+          </w:p>
+        </w:tc>
+        <w:tc>
+          <w:tcPr>
+            <w:tcW w:type="dxa" w:w="3456"/>
+            <w:shd w:fill="D9EAF7"/>
+            <w:vAlign w:val="top"/>
+          </w:tcPr>
+          <w:p>
+            <w:r>
+              <w:t>URL / Port</w:t>
+            </w:r>
+          </w:p>
+        </w:tc>
+        <w:tc>
+          <w:tcPr>
+            <w:tcW w:type="dxa" w:w="3456"/>
+            <w:shd w:fill="D9EAF7"/>
+            <w:vAlign w:val="top"/>
+          </w:tcPr>
+          <w:p>
+            <w:r>
+              <w:t>Purpose</w:t>
+            </w:r>
+          </w:p>
+        </w:tc>
+      </w:tr>
+      <w:tr>
+        <w:tc>
+          <w:tcPr>
+            <w:tcW w:type="dxa" w:w="3456"/>
+            <w:vAlign w:val="top"/>
+          </w:tcPr>
+          <w:p>
+            <w:r>
+              <w:t>Apache Hop Web</w:t>
+            </w:r>
+          </w:p>
+        </w:tc>
+        <w:tc>
+          <w:tcPr>
+            <w:tcW w:type="dxa" w:w="3456"/>
+            <w:vAlign w:val="top"/>
+          </w:tcPr>
+          <w:p>
+            <w:r>
+              <w:t>http://localhost:8082/ui</w:t>
+            </w:r>
+          </w:p>
+        </w:tc>
+        <w:tc>
+          <w:tcPr>
+            <w:tcW w:type="dxa" w:w="3456"/>
+            <w:vAlign w:val="top"/>
+          </w:tcPr>
+          <w:p>
+            <w:r>
+              <w:t>Browser-based Hop UI for visual pipeline/workflow design.</w:t>
+            </w:r>
+          </w:p>
+        </w:tc>
+      </w:tr>
+      <w:tr>
+        <w:tc>
+          <w:tcPr>
+            <w:tcW w:type="dxa" w:w="3456"/>
+            <w:vAlign w:val="top"/>
+          </w:tcPr>
+          <w:p>
+            <w:r>
+              <w:t>Apache Hop Server</w:t>
+            </w:r>
+          </w:p>
+        </w:tc>
+        <w:tc>
+          <w:tcPr>
+            <w:tcW w:type="dxa" w:w="3456"/>
+            <w:vAlign w:val="top"/>
+          </w:tcPr>
+          <w:p>
+            <w:r>
+              <w:t>http://localhost:8181</w:t>
+            </w:r>
+          </w:p>
+        </w:tc>
+        <w:tc>
+          <w:tcPr>
+            <w:tcW w:type="dxa" w:w="3456"/>
+            <w:vAlign w:val="top"/>
+          </w:tcPr>
+          <w:p>
+            <w:r>
+              <w:t>Runtime/status endpoint. This is not the visual designer.</w:t>
+            </w:r>
+          </w:p>
+        </w:tc>
+      </w:tr>
+      <w:tr>
+        <w:tc>
+          <w:tcPr>
+            <w:tcW w:type="dxa" w:w="3456"/>
+            <w:vAlign w:val="top"/>
+          </w:tcPr>
+          <w:p>
+            <w:r>
+              <w:t>Kafka UI</w:t>
+            </w:r>
+          </w:p>
+        </w:tc>
+        <w:tc>
+          <w:tcPr>
+            <w:tcW w:type="dxa" w:w="3456"/>
+            <w:vAlign w:val="top"/>
+          </w:tcPr>
+          <w:p>
+            <w:r>
+              <w:t>http://localhost:8080/ui/clusters/local/all-topics</w:t>
+            </w:r>
+          </w:p>
+        </w:tc>
+        <w:tc>
+          <w:tcPr>
+            <w:tcW w:type="dxa" w:w="3456"/>
+            <w:vAlign w:val="top"/>
+          </w:tcPr>
+          <w:p>
+            <w:r>
+              <w:t>View topics and message counts.</w:t>
+            </w:r>
+          </w:p>
+        </w:tc>
+      </w:tr>
+      <w:tr>
+        <w:tc>
+          <w:tcPr>
+            <w:tcW w:type="dxa" w:w="3456"/>
+            <w:vAlign w:val="top"/>
+          </w:tcPr>
+          <w:p>
+            <w:r>
+              <w:t>Schema Registry</w:t>
+            </w:r>
+          </w:p>
+        </w:tc>
+        <w:tc>
+          <w:tcPr>
+            <w:tcW w:type="dxa" w:w="3456"/>
+            <w:vAlign w:val="top"/>
+          </w:tcPr>
+          <w:p>
+            <w:r>
+              <w:t>http://localhost:8081</w:t>
+            </w:r>
+          </w:p>
+        </w:tc>
+        <w:tc>
+          <w:tcPr>
+            <w:tcW w:type="dxa" w:w="3456"/>
+            <w:vAlign w:val="top"/>
+          </w:tcPr>
+          <w:p>
+            <w:r>
+              <w:t>Schema Registry API endpoint.</w:t>
+            </w:r>
+          </w:p>
+        </w:tc>
+      </w:tr>
+      <w:tr>
+        <w:tc>
+          <w:tcPr>
+            <w:tcW w:type="dxa" w:w="3456"/>
+            <w:vAlign w:val="top"/>
+          </w:tcPr>
+          <w:p>
+            <w:r>
+              <w:t>Kafka bootstrap</w:t>
+            </w:r>
+          </w:p>
+        </w:tc>
+        <w:tc>
+          <w:tcPr>
+            <w:tcW w:type="dxa" w:w="3456"/>
+            <w:vAlign w:val="top"/>
+          </w:tcPr>
+          <w:p>
+            <w:r>
+              <w:t>localhost:9092</w:t>
+            </w:r>
+          </w:p>
+        </w:tc>
+        <w:tc>
+          <w:tcPr>
+            <w:tcW w:type="dxa" w:w="3456"/>
+            <w:vAlign w:val="top"/>
+          </w:tcPr>
+          <w:p>
+            <w:r>
+              <w:t>Host Python producer/consumer connection.</w:t>
+            </w:r>
+          </w:p>
+        </w:tc>
+      </w:tr>
+    </w:tbl>
+    <w:p>
+      <w:pPr>
+        <w:pStyle w:val="Heading1"/>
+      </w:pPr>
+      <w:r>
+        <w:t>Install / Start with Docker on Linux</w:t>
       </w:r>
     </w:p>
     <w:p>
       <w:pPr>
-        <w:pStyle w:val="BodyText"/>
+        <w:spacing w:before="80" w:after="160"/>
       </w:pPr>
       <w:r>
-        <w:t>Build visual transformation pipelines using Apache Hop. You will clean CSV data, merge datasets, process Kafka events, and orchestrate pipelines with workflows.</w:t>
+        <w:rPr>
+          <w:rFonts w:ascii="Consolas" w:hAnsi="Consolas" w:eastAsia="Consolas"/>
+          <w:sz w:val="17"/>
+        </w:rPr>
+        <w:t># Install Docker if needed on Ubuntu/Linux.</w:t>
+      </w:r>
+      <w:r>
+        <w:br/>
+      </w:r>
+      <w:r>
+        <w:rPr>
+          <w:rFonts w:ascii="Consolas" w:hAnsi="Consolas" w:eastAsia="Consolas"/>
+          <w:sz w:val="17"/>
+        </w:rPr>
+        <w:t>sudo apt-get update</w:t>
+      </w:r>
+      <w:r>
+        <w:br/>
+      </w:r>
+      <w:r>
+        <w:rPr>
+          <w:rFonts w:ascii="Consolas" w:hAnsi="Consolas" w:eastAsia="Consolas"/>
+          <w:sz w:val="17"/>
+        </w:rPr>
+        <w:t>sudo apt-get install -y ca-certificates curl gnupg</w:t>
+      </w:r>
+      <w:r>
+        <w:br/>
+      </w:r>
+      <w:r>
+        <w:rPr>
+          <w:rFonts w:ascii="Consolas" w:hAnsi="Consolas" w:eastAsia="Consolas"/>
+          <w:sz w:val="17"/>
+        </w:rPr>
+        <w:t>sudo install -m 0755 -d /etc/apt/keyrings</w:t>
+      </w:r>
+      <w:r>
+        <w:br/>
+      </w:r>
+      <w:r>
+        <w:rPr>
+          <w:rFonts w:ascii="Consolas" w:hAnsi="Consolas" w:eastAsia="Consolas"/>
+          <w:sz w:val="17"/>
+        </w:rPr>
+        <w:t>curl -fsSL https://download.docker.com/linux/ubuntu/gpg | sudo gpg --dearmor -o /etc/apt/keyrings/docker.gpg</w:t>
+      </w:r>
+      <w:r>
+        <w:br/>
+      </w:r>
+      <w:r>
+        <w:rPr>
+          <w:rFonts w:ascii="Consolas" w:hAnsi="Consolas" w:eastAsia="Consolas"/>
+          <w:sz w:val="17"/>
+        </w:rPr>
+        <w:t>sudo chmod a+r /etc/apt/keyrings/docker.gpg</w:t>
+      </w:r>
+      <w:r>
+        <w:br/>
+      </w:r>
+      <w:r>
+        <w:rPr>
+          <w:rFonts w:ascii="Consolas" w:hAnsi="Consolas" w:eastAsia="Consolas"/>
+          <w:sz w:val="17"/>
+        </w:rPr>
+        <w:t>. /etc/os-release</w:t>
+      </w:r>
+      <w:r>
+        <w:br/>
+      </w:r>
+      <w:r>
+        <w:rPr>
+          <w:rFonts w:ascii="Consolas" w:hAnsi="Consolas" w:eastAsia="Consolas"/>
+          <w:sz w:val="17"/>
+        </w:rPr>
+        <w:t>echo "deb [arch=$(dpkg --print-architecture) signed-by=/etc/apt/keyrings/docker.gpg] https://download.docker.com/linux/ubuntu $VERSION_CODENAME stable" | sudo tee /etc/apt/sources.list.d/docker.list &gt; /dev/null</w:t>
+      </w:r>
+      <w:r>
+        <w:br/>
+      </w:r>
+      <w:r>
+        <w:rPr>
+          <w:rFonts w:ascii="Consolas" w:hAnsi="Consolas" w:eastAsia="Consolas"/>
+          <w:sz w:val="17"/>
+        </w:rPr>
+        <w:t>sudo apt-get update</w:t>
+      </w:r>
+      <w:r>
+        <w:br/>
+      </w:r>
+      <w:r>
+        <w:rPr>
+          <w:rFonts w:ascii="Consolas" w:hAnsi="Consolas" w:eastAsia="Consolas"/>
+          <w:sz w:val="17"/>
+        </w:rPr>
+        <w:t>sudo apt-get install -y docker-ce docker-ce-cli containerd.io docker-buildx-plugin docker-compose-plugin</w:t>
       </w:r>
     </w:p>
     <w:p>
@@ -36,15 +414,55 @@
         <w:pStyle w:val="Heading1"/>
       </w:pPr>
       <w:r>
-        <w:t>Prerequisites</w:t>
+        <w:t>Install / Start with Docker on Windows</w:t>
       </w:r>
     </w:p>
     <w:p>
       <w:pPr>
-        <w:pStyle w:val="BodyText"/>
+        <w:pStyle w:val="ListNumber"/>
       </w:pPr>
       <w:r>
-        <w:t>Apache Hop, Java, Docker, Python 3, kafka-python, and the Day 6 lab-code folder.</w:t>
+        <w:t>Install Docker Desktop for Windows.</w:t>
+      </w:r>
+    </w:p>
+    <w:p>
+      <w:pPr>
+        <w:pStyle w:val="ListNumber"/>
+      </w:pPr>
+      <w:r>
+        <w:t>Enable WSL 2 backend during setup.</w:t>
+      </w:r>
+    </w:p>
+    <w:p>
+      <w:pPr>
+        <w:pStyle w:val="ListNumber"/>
+      </w:pPr>
+      <w:r>
+        <w:t>Open Docker Desktop and wait until Docker Engine is running.</w:t>
+      </w:r>
+    </w:p>
+    <w:p>
+      <w:pPr>
+        <w:pStyle w:val="ListNumber"/>
+      </w:pPr>
+      <w:r>
+        <w:t>Open PowerShell or WSL Ubuntu.</w:t>
+      </w:r>
+    </w:p>
+    <w:p>
+      <w:pPr>
+        <w:pStyle w:val="ListNumber"/>
+      </w:pPr>
+      <w:r>
+        <w:t>Run docker --version and docker compose version.</w:t>
+      </w:r>
+    </w:p>
+    <w:p>
+      <w:pPr>
+        <w:pStyle w:val="ListNumber"/>
+      </w:pPr>
+      <w:r>
+        <w:t>Run this lab from Week_02/Day_06/Lab_Files.</w:t>
       </w:r>
     </w:p>
     <w:p>
@@ -52,15 +470,39 @@
         <w:pStyle w:val="Heading1"/>
       </w:pPr>
       <w:r>
-        <w:t>Exercise 1 – Batch Cleaning Pipeline</w:t>
+        <w:t>Step 1 - Stop Old Containers</w:t>
       </w:r>
     </w:p>
     <w:p>
       <w:pPr>
-        <w:pStyle w:val="BodyText"/>
+        <w:spacing w:before="80" w:after="160"/>
       </w:pPr>
       <w:r>
-        <w:t>Create a Hop pipeline: Text File Input → Filter Rows → Select Values/Formula → Sort Rows → Unique Rows → Text File Output. Use customers.csv and write customers_cleaned.csv.</w:t>
+        <w:rPr>
+          <w:rFonts w:ascii="Consolas" w:hAnsi="Consolas" w:eastAsia="Consolas"/>
+          <w:sz w:val="17"/>
+        </w:rPr>
+        <w:t>cd Week_02/Day_06/Lab_Files</w:t>
+      </w:r>
+      <w:r>
+        <w:br/>
+      </w:r>
+      <w:r>
+        <w:rPr>
+          <w:rFonts w:ascii="Consolas" w:hAnsi="Consolas" w:eastAsia="Consolas"/>
+          <w:sz w:val="17"/>
+        </w:rPr>
+        <w:t>sudo docker compose down</w:t>
+      </w:r>
+      <w:r>
+        <w:br/>
+      </w:r>
+      <w:r>
+        <w:rPr>
+          <w:rFonts w:ascii="Consolas" w:hAnsi="Consolas" w:eastAsia="Consolas"/>
+          <w:sz w:val="17"/>
+        </w:rPr>
+        <w:t>sudo docker rm -f hop-web apache-hop-server</w:t>
       </w:r>
     </w:p>
     <w:p>
@@ -68,15 +510,39 @@
         <w:pStyle w:val="Heading1"/>
       </w:pPr>
       <w:r>
-        <w:t>Exercise 2 – Join and Enrich</w:t>
+        <w:t>Step 2 - Start Kafka, Schema Registry, and Kafka UI</w:t>
       </w:r>
     </w:p>
     <w:p>
       <w:pPr>
-        <w:pStyle w:val="BodyText"/>
+        <w:spacing w:before="80" w:after="160"/>
       </w:pPr>
       <w:r>
-        <w:t>Read orders.csv and products.csv. Sort by product_id, join the streams, map category values, and write enriched_orders.csv.</w:t>
+        <w:rPr>
+          <w:rFonts w:ascii="Consolas" w:hAnsi="Consolas" w:eastAsia="Consolas"/>
+          <w:sz w:val="17"/>
+        </w:rPr>
+        <w:t>cd Week_02/Day_06/Lab_Files</w:t>
+      </w:r>
+      <w:r>
+        <w:br/>
+      </w:r>
+      <w:r>
+        <w:rPr>
+          <w:rFonts w:ascii="Consolas" w:hAnsi="Consolas" w:eastAsia="Consolas"/>
+          <w:sz w:val="17"/>
+        </w:rPr>
+        <w:t>sudo docker compose up -d</w:t>
+      </w:r>
+      <w:r>
+        <w:br/>
+      </w:r>
+      <w:r>
+        <w:rPr>
+          <w:rFonts w:ascii="Consolas" w:hAnsi="Consolas" w:eastAsia="Consolas"/>
+          <w:sz w:val="17"/>
+        </w:rPr>
+        <w:t>sudo docker compose ps</w:t>
       </w:r>
     </w:p>
     <w:p>
@@ -84,15 +550,120 @@
         <w:pStyle w:val="Heading1"/>
       </w:pPr>
       <w:r>
-        <w:t>Exercise 3 – Kafka Streaming Pipeline</w:t>
+        <w:t>Step 3 - Start Apache Hop Web and Hop Server</w:t>
       </w:r>
     </w:p>
     <w:p>
       <w:pPr>
-        <w:pStyle w:val="BodyText"/>
+        <w:spacing w:before="80" w:after="160"/>
       </w:pPr>
       <w:r>
-        <w:t>Start docker-compose. Run orders_producer.py. In Hop, use Kafka Consumer on orders.cdc, filter NEW orders, deduplicate by order_id, and publish to orders.cleaned with Kafka Producer.</w:t>
+        <w:rPr>
+          <w:rFonts w:ascii="Consolas" w:hAnsi="Consolas" w:eastAsia="Consolas"/>
+          <w:sz w:val="17"/>
+        </w:rPr>
+        <w:t>sudo docker run -d --rm --name hop-web -p 8082:8080 apache/hop-web</w:t>
+      </w:r>
+      <w:r>
+        <w:br/>
+      </w:r>
+      <w:r>
+        <w:rPr>
+          <w:rFonts w:ascii="Consolas" w:hAnsi="Consolas" w:eastAsia="Consolas"/>
+          <w:sz w:val="17"/>
+        </w:rPr>
+      </w:r>
+      <w:r>
+        <w:br/>
+      </w:r>
+      <w:r>
+        <w:rPr>
+          <w:rFonts w:ascii="Consolas" w:hAnsi="Consolas" w:eastAsia="Consolas"/>
+          <w:sz w:val="17"/>
+        </w:rPr>
+        <w:t>sudo docker run -d --rm --name apache-hop-server   -e HOP_SERVER_USER=admin   -e HOP_SERVER_PASS=admin   -e HOP_SERVER_HOSTNAME=0.0.0.0   -e HOP_SERVER_PORT=8181   -p 8181:8181   apache/hop</w:t>
+      </w:r>
+    </w:p>
+    <w:p>
+      <w:r>
+        <w:t>Open Hop Web at http://localhost:8082/ui. This is the visual UI to create pipelines and workflows.</w:t>
+      </w:r>
+    </w:p>
+    <w:p>
+      <w:r>
+        <w:drawing>
+          <wp:inline xmlns:a="http://schemas.openxmlformats.org/drawingml/2006/main" xmlns:pic="http://schemas.openxmlformats.org/drawingml/2006/picture">
+            <wp:extent cx="6126480" cy="3675888"/>
+            <wp:docPr id="1" name="Picture 1"/>
+            <wp:cNvGraphicFramePr>
+              <a:graphicFrameLocks noChangeAspect="1"/>
+            </wp:cNvGraphicFramePr>
+            <a:graphic>
+              <a:graphicData uri="http://schemas.openxmlformats.org/drawingml/2006/picture">
+                <pic:pic>
+                  <pic:nvPicPr>
+                    <pic:cNvPr id="0" name="01-hop-web-real.png"/>
+                    <pic:cNvPicPr/>
+                  </pic:nvPicPr>
+                  <pic:blipFill>
+                    <a:blip r:embed="rId9"/>
+                    <a:stretch>
+                      <a:fillRect/>
+                    </a:stretch>
+                  </pic:blipFill>
+                  <pic:spPr>
+                    <a:xfrm>
+                      <a:off x="0" y="0"/>
+                      <a:ext cx="6126480" cy="3675888"/>
+                    </a:xfrm>
+                    <a:prstGeom prst="rect"/>
+                  </pic:spPr>
+                </pic:pic>
+              </a:graphicData>
+            </a:graphic>
+          </wp:inline>
+        </w:drawing>
+      </w:r>
+    </w:p>
+    <w:p>
+      <w:r>
+        <w:t>Hop Server at http://localhost:8181 is only the runtime/status endpoint.</w:t>
+      </w:r>
+    </w:p>
+    <w:p>
+      <w:r>
+        <w:drawing>
+          <wp:inline xmlns:a="http://schemas.openxmlformats.org/drawingml/2006/main" xmlns:pic="http://schemas.openxmlformats.org/drawingml/2006/picture">
+            <wp:extent cx="6126480" cy="3675888"/>
+            <wp:docPr id="2" name="Picture 2"/>
+            <wp:cNvGraphicFramePr>
+              <a:graphicFrameLocks noChangeAspect="1"/>
+            </wp:cNvGraphicFramePr>
+            <a:graphic>
+              <a:graphicData uri="http://schemas.openxmlformats.org/drawingml/2006/picture">
+                <pic:pic>
+                  <pic:nvPicPr>
+                    <pic:cNvPr id="0" name="03-hop-server-real.png"/>
+                    <pic:cNvPicPr/>
+                  </pic:nvPicPr>
+                  <pic:blipFill>
+                    <a:blip r:embed="rId10"/>
+                    <a:stretch>
+                      <a:fillRect/>
+                    </a:stretch>
+                  </pic:blipFill>
+                  <pic:spPr>
+                    <a:xfrm>
+                      <a:off x="0" y="0"/>
+                      <a:ext cx="6126480" cy="3675888"/>
+                    </a:xfrm>
+                    <a:prstGeom prst="rect"/>
+                  </pic:spPr>
+                </pic:pic>
+              </a:graphicData>
+            </a:graphic>
+          </wp:inline>
+        </w:drawing>
       </w:r>
     </w:p>
     <w:p>
@@ -100,15 +671,52 @@
         <w:pStyle w:val="Heading1"/>
       </w:pPr>
       <w:r>
-        <w:t>Exercise 4 – Workflow Orchestration</w:t>
+        <w:t>Exercise 1 - Batch Cleaning Pipeline</w:t>
+      </w:r>
+    </w:p>
+    <w:p>
+      <w:r>
+        <w:t>Target Hop design: Text File Input -&gt; Filter Rows -&gt; Select Values/Formula -&gt; Sort Rows -&gt; Unique Rows -&gt; Text File Output.</w:t>
       </w:r>
     </w:p>
     <w:p>
       <w:pPr>
-        <w:pStyle w:val="BodyText"/>
+        <w:pStyle w:val="ListNumber"/>
       </w:pPr>
       <w:r>
-        <w:t>Create a workflow: Start → Run Pipeline → Archive processed files → Log/notify success. Add a failure path for error handling.</w:t>
+        <w:t>Read customers.csv.</w:t>
+      </w:r>
+    </w:p>
+    <w:p>
+      <w:pPr>
+        <w:pStyle w:val="ListNumber"/>
+      </w:pPr>
+      <w:r>
+        <w:t>Normalize phone numbers from 00... to +....</w:t>
+      </w:r>
+    </w:p>
+    <w:p>
+      <w:pPr>
+        <w:pStyle w:val="ListNumber"/>
+      </w:pPr>
+      <w:r>
+        <w:t>Sort by customer_id.</w:t>
+      </w:r>
+    </w:p>
+    <w:p>
+      <w:pPr>
+        <w:pStyle w:val="ListNumber"/>
+      </w:pPr>
+      <w:r>
+        <w:t>Remove duplicate customer records.</w:t>
+      </w:r>
+    </w:p>
+    <w:p>
+      <w:pPr>
+        <w:pStyle w:val="ListNumber"/>
+      </w:pPr>
+      <w:r>
+        <w:t>Write customers_cleaned.csv.</w:t>
       </w:r>
     </w:p>
     <w:p>
@@ -116,15 +724,12 @@
         <w:pStyle w:val="Heading1"/>
       </w:pPr>
       <w:r>
-        <w:t>Mini Exercises</w:t>
+        <w:t>Exercise 2 - Join and Enrich Orders</w:t>
       </w:r>
     </w:p>
     <w:p>
-      <w:pPr>
-        <w:pStyle w:val="BodyText"/>
-      </w:pPr>
       <w:r>
-        <w:t>Classify tasks as pipeline/workflow, match transformations to examples, design an inventory reorder streaming pipeline, and troubleshoot join/consumer issues.</w:t>
+        <w:t>Target Hop design: read orders.csv and products.csv, sort by product_id, join, normalize categories, and write enriched_orders.csv.</w:t>
       </w:r>
     </w:p>
     <w:p>
@@ -132,20 +737,357 @@
         <w:pStyle w:val="Heading1"/>
       </w:pPr>
       <w:r>
-        <w:t>MCQ Answer Key</w:t>
+        <w:t>Exercise 3 - Kafka Streaming Pipeline</w:t>
+      </w:r>
+    </w:p>
+    <w:p>
+      <w:r>
+        <w:t>Produce source CDC-style events, keep only NEW orders, deduplicate by order_id, and publish to orders.cleaned.</w:t>
       </w:r>
     </w:p>
     <w:p>
       <w:pPr>
-        <w:pStyle w:val="BodyText"/>
+        <w:spacing w:before="80" w:after="160"/>
       </w:pPr>
       <w:r>
-        <w:t>1=A, 2=B, 3=A, 4=A. See slide deck for questions.</w:t>
+        <w:rPr>
+          <w:rFonts w:ascii="Consolas" w:hAnsi="Consolas" w:eastAsia="Consolas"/>
+          <w:sz w:val="17"/>
+        </w:rPr>
+        <w:t>cd Week_02/Day_06/Lab_Files</w:t>
+      </w:r>
+      <w:r>
+        <w:br/>
+      </w:r>
+      <w:r>
+        <w:rPr>
+          <w:rFonts w:ascii="Consolas" w:hAnsi="Consolas" w:eastAsia="Consolas"/>
+          <w:sz w:val="17"/>
+        </w:rPr>
+        <w:t>python3 orders_producer.py</w:t>
+      </w:r>
+      <w:r>
+        <w:br/>
+      </w:r>
+      <w:r>
+        <w:rPr>
+          <w:rFonts w:ascii="Consolas" w:hAnsi="Consolas" w:eastAsia="Consolas"/>
+          <w:sz w:val="17"/>
+        </w:rPr>
+        <w:t>python3 day6_runnable_equivalent.py</w:t>
+      </w:r>
+    </w:p>
+    <w:p>
+      <w:r>
+        <w:t>Open Kafka UI at http://localhost:8080/ui/clusters/local/all-topics and verify orders.cdc has 3 messages and orders.cleaned has 2 messages.</w:t>
+      </w:r>
+    </w:p>
+    <w:p>
+      <w:r>
+        <w:drawing>
+          <wp:inline xmlns:a="http://schemas.openxmlformats.org/drawingml/2006/main" xmlns:pic="http://schemas.openxmlformats.org/drawingml/2006/picture">
+            <wp:extent cx="6126480" cy="3675888"/>
+            <wp:docPr id="3" name="Picture 3"/>
+            <wp:cNvGraphicFramePr>
+              <a:graphicFrameLocks noChangeAspect="1"/>
+            </wp:cNvGraphicFramePr>
+            <a:graphic>
+              <a:graphicData uri="http://schemas.openxmlformats.org/drawingml/2006/picture">
+                <pic:pic>
+                  <pic:nvPicPr>
+                    <pic:cNvPr id="0" name="02-kafka-ui-topics-real.png"/>
+                    <pic:cNvPicPr/>
+                  </pic:nvPicPr>
+                  <pic:blipFill>
+                    <a:blip r:embed="rId11"/>
+                    <a:stretch>
+                      <a:fillRect/>
+                    </a:stretch>
+                  </pic:blipFill>
+                  <pic:spPr>
+                    <a:xfrm>
+                      <a:off x="0" y="0"/>
+                      <a:ext cx="6126480" cy="3675888"/>
+                    </a:xfrm>
+                    <a:prstGeom prst="rect"/>
+                  </pic:spPr>
+                </pic:pic>
+              </a:graphicData>
+            </a:graphic>
+          </wp:inline>
+        </w:drawing>
+      </w:r>
+    </w:p>
+    <w:p>
+      <w:pPr>
+        <w:pStyle w:val="Heading1"/>
+      </w:pPr>
+      <w:r>
+        <w:t>Validation Output</w:t>
+      </w:r>
+    </w:p>
+    <w:p>
+      <w:pPr>
+        <w:spacing w:before="80" w:after="160"/>
+      </w:pPr>
+      <w:r>
+        <w:rPr>
+          <w:rFonts w:ascii="Consolas" w:hAnsi="Consolas" w:eastAsia="Consolas"/>
+          <w:sz w:val="17"/>
+        </w:rPr>
+        <w:t>Wrote 3 cleaned customers to customers_cleaned.csv</w:t>
+      </w:r>
+      <w:r>
+        <w:br/>
+      </w:r>
+      <w:r>
+        <w:rPr>
+          <w:rFonts w:ascii="Consolas" w:hAnsi="Consolas" w:eastAsia="Consolas"/>
+          <w:sz w:val="17"/>
+        </w:rPr>
+        <w:t>Wrote 3 enriched orders to enriched_orders.csv</w:t>
+      </w:r>
+      <w:r>
+        <w:br/>
+      </w:r>
+      <w:r>
+        <w:rPr>
+          <w:rFonts w:ascii="Consolas" w:hAnsi="Consolas" w:eastAsia="Consolas"/>
+          <w:sz w:val="17"/>
+        </w:rPr>
+        <w:t>Consumed 3 events from orders.cdc</w:t>
+      </w:r>
+      <w:r>
+        <w:br/>
+      </w:r>
+      <w:r>
+        <w:rPr>
+          <w:rFonts w:ascii="Consolas" w:hAnsi="Consolas" w:eastAsia="Consolas"/>
+          <w:sz w:val="17"/>
+        </w:rPr>
+        <w:t>Produced 2 deduplicated NEW events to orders.cleaned</w:t>
+      </w:r>
+    </w:p>
+    <w:p>
+      <w:pPr>
+        <w:pStyle w:val="Heading1"/>
+      </w:pPr>
+      <w:r>
+        <w:t>Exercise 4 - Workflow Orchestration</w:t>
+      </w:r>
+    </w:p>
+    <w:p>
+      <w:r>
+        <w:t>Create a workflow in Hop Web with this shape:</w:t>
+      </w:r>
+    </w:p>
+    <w:p>
+      <w:pPr>
+        <w:spacing w:before="80" w:after="160"/>
+      </w:pPr>
+      <w:r>
+        <w:rPr>
+          <w:rFonts w:ascii="Consolas" w:hAnsi="Consolas" w:eastAsia="Consolas"/>
+          <w:sz w:val="17"/>
+        </w:rPr>
+        <w:t>Start -&gt; Run Pipeline -&gt; Archive processed files -&gt; Log success</w:t>
+      </w:r>
+      <w:r>
+        <w:br/>
+      </w:r>
+      <w:r>
+        <w:rPr>
+          <w:rFonts w:ascii="Consolas" w:hAnsi="Consolas" w:eastAsia="Consolas"/>
+          <w:sz w:val="17"/>
+        </w:rPr>
+        <w:t xml:space="preserve">                         -&gt; Failure path -&gt; Log failure</w:t>
+      </w:r>
+    </w:p>
+    <w:p>
+      <w:pPr>
+        <w:pStyle w:val="Heading1"/>
+      </w:pPr>
+      <w:r>
+        <w:t>Troubleshooting</w:t>
+      </w:r>
+    </w:p>
+    <w:tbl>
+      <w:tblPr>
+        <w:tblStyle w:val="TableGrid"/>
+        <w:tblW w:type="auto" w:w="0"/>
+        <w:jc w:val="center"/>
+        <w:tblLook w:firstColumn="1" w:firstRow="1" w:lastColumn="0" w:lastRow="0" w:noHBand="0" w:noVBand="1" w:val="04A0"/>
+      </w:tblPr>
+      <w:tblGrid>
+        <w:gridCol w:w="5184"/>
+        <w:gridCol w:w="5184"/>
+      </w:tblGrid>
+      <w:tr>
+        <w:tc>
+          <w:tcPr>
+            <w:tcW w:type="dxa" w:w="5184"/>
+            <w:shd w:fill="D9EAF7"/>
+            <w:vAlign w:val="top"/>
+          </w:tcPr>
+          <w:p>
+            <w:r>
+              <w:t>Issue</w:t>
+            </w:r>
+          </w:p>
+        </w:tc>
+        <w:tc>
+          <w:tcPr>
+            <w:tcW w:type="dxa" w:w="5184"/>
+            <w:shd w:fill="D9EAF7"/>
+            <w:vAlign w:val="top"/>
+          </w:tcPr>
+          <w:p>
+            <w:r>
+              <w:t>Fix</w:t>
+            </w:r>
+          </w:p>
+        </w:tc>
+      </w:tr>
+      <w:tr>
+        <w:tc>
+          <w:tcPr>
+            <w:tcW w:type="dxa" w:w="5184"/>
+            <w:vAlign w:val="top"/>
+          </w:tcPr>
+          <w:p>
+            <w:r>
+              <w:t>Hop Web does not open</w:t>
+            </w:r>
+          </w:p>
+        </w:tc>
+        <w:tc>
+          <w:tcPr>
+            <w:tcW w:type="dxa" w:w="5184"/>
+            <w:vAlign w:val="top"/>
+          </w:tcPr>
+          <w:p>
+            <w:r>
+              <w:t>Check docker ps and confirm hop-web maps 8082-&gt;8080.</w:t>
+            </w:r>
+          </w:p>
+        </w:tc>
+      </w:tr>
+      <w:tr>
+        <w:tc>
+          <w:tcPr>
+            <w:tcW w:type="dxa" w:w="5184"/>
+            <w:vAlign w:val="top"/>
+          </w:tcPr>
+          <w:p>
+            <w:r>
+              <w:t>Kafka UI does not show orders.cleaned</w:t>
+            </w:r>
+          </w:p>
+        </w:tc>
+        <w:tc>
+          <w:tcPr>
+            <w:tcW w:type="dxa" w:w="5184"/>
+            <w:vAlign w:val="top"/>
+          </w:tcPr>
+          <w:p>
+            <w:r>
+              <w:t>Rerun python3 orders_producer.py and python3 day6_runnable_equivalent.py.</w:t>
+            </w:r>
+          </w:p>
+        </w:tc>
+      </w:tr>
+      <w:tr>
+        <w:tc>
+          <w:tcPr>
+            <w:tcW w:type="dxa" w:w="5184"/>
+            <w:vAlign w:val="top"/>
+          </w:tcPr>
+          <w:p>
+            <w:r>
+              <w:t>Port 8080 conflict</w:t>
+            </w:r>
+          </w:p>
+        </w:tc>
+        <w:tc>
+          <w:tcPr>
+            <w:tcW w:type="dxa" w:w="5184"/>
+            <w:vAlign w:val="top"/>
+          </w:tcPr>
+          <w:p>
+            <w:r>
+              <w:t>Keep Kafka UI on 8080 and run Hop Web on 8082.</w:t>
+            </w:r>
+          </w:p>
+        </w:tc>
+      </w:tr>
+      <w:tr>
+        <w:tc>
+          <w:tcPr>
+            <w:tcW w:type="dxa" w:w="5184"/>
+            <w:vAlign w:val="top"/>
+          </w:tcPr>
+          <w:p>
+            <w:r>
+              <w:t>Hop Server opens but no designer appears</w:t>
+            </w:r>
+          </w:p>
+        </w:tc>
+        <w:tc>
+          <w:tcPr>
+            <w:tcW w:type="dxa" w:w="5184"/>
+            <w:vAlign w:val="top"/>
+          </w:tcPr>
+          <w:p>
+            <w:r>
+              <w:t>Use Hop Web at 8082/ui for the visual designer.</w:t>
+            </w:r>
+          </w:p>
+        </w:tc>
+      </w:tr>
+    </w:tbl>
+    <w:p>
+      <w:pPr>
+        <w:pStyle w:val="Heading1"/>
+      </w:pPr>
+      <w:r>
+        <w:t>Official References</w:t>
+      </w:r>
+    </w:p>
+    <w:p>
+      <w:pPr>
+        <w:pStyle w:val="ListBullet"/>
+      </w:pPr>
+      <w:r>
+        <w:t>Docker Engine on Ubuntu: https://docs.docker.com/engine/install/ubuntu/</w:t>
+      </w:r>
+    </w:p>
+    <w:p>
+      <w:pPr>
+        <w:pStyle w:val="ListBullet"/>
+      </w:pPr>
+      <w:r>
+        <w:t>Docker Desktop on Windows: https://docs.docker.com/desktop/setup/install/windows-install/</w:t>
+      </w:r>
+    </w:p>
+    <w:p>
+      <w:pPr>
+        <w:pStyle w:val="ListBullet"/>
+      </w:pPr>
+      <w:r>
+        <w:t>Apache Hop Docker images: https://hub.docker.com/r/apache/hop</w:t>
+      </w:r>
+    </w:p>
+    <w:p>
+      <w:pPr>
+        <w:pStyle w:val="ListBullet"/>
+      </w:pPr>
+      <w:r>
+        <w:t>Kafka UI project: https://github.com/provectus/kafka-ui</w:t>
       </w:r>
     </w:p>
     <w:sectPr>
       <w:pgSz w:w="12240" w:h="15840"/>
-      <w:pgMar w:top="1440" w:right="1800" w:bottom="1440" w:left="1800" w:header="720" w:footer="720" w:gutter="0"/>
+      <w:pgMar w:top="792" w:right="936" w:bottom="792" w:left="936" w:header="720" w:footer="720" w:gutter="0"/>
       <w:cols w:space="720"/>
       <w:docGrid w:linePitch="360"/>
     </w:sectPr>
@@ -516,6 +1458,10 @@
     <w:name w:val="Normal"/>
     <w:qFormat/>
     <w:rsid w:val="00FC693F"/>
+    <w:rPr>
+      <w:rFonts w:ascii="Arial" w:hAnsi="Arial"/>
+      <w:sz w:val="20"/>
+    </w:rPr>
   </w:style>
   <w:style w:type="paragraph" w:styleId="Header">
     <w:name w:val="header"/>
@@ -576,10 +1522,10 @@
       <w:outlineLvl w:val="0"/>
     </w:pPr>
     <w:rPr>
-      <w:rFonts w:asciiTheme="majorHAnsi" w:eastAsiaTheme="majorEastAsia" w:hAnsiTheme="majorHAnsi" w:cstheme="majorBidi"/>
+      <w:rFonts w:asciiTheme="majorHAnsi" w:eastAsiaTheme="majorEastAsia" w:hAnsiTheme="majorHAnsi" w:cstheme="majorBidi" w:ascii="Arial" w:hAnsi="Arial"/>
       <w:b/>
       <w:bCs/>
-      <w:color w:val="365F91" w:themeColor="accent1" w:themeShade="BF"/>
+      <w:color w:val="17365D"/>
       <w:sz w:val="28"/>
       <w:szCs w:val="28"/>
     </w:rPr>
@@ -600,10 +1546,10 @@
       <w:outlineLvl w:val="1"/>
     </w:pPr>
     <w:rPr>
-      <w:rFonts w:asciiTheme="majorHAnsi" w:eastAsiaTheme="majorEastAsia" w:hAnsiTheme="majorHAnsi" w:cstheme="majorBidi"/>
+      <w:rFonts w:asciiTheme="majorHAnsi" w:eastAsiaTheme="majorEastAsia" w:hAnsiTheme="majorHAnsi" w:cstheme="majorBidi" w:ascii="Arial" w:hAnsi="Arial"/>
       <w:b/>
       <w:bCs/>
-      <w:color w:val="4F81BD" w:themeColor="accent1"/>
+      <w:color w:val="1F4E79"/>
       <w:sz w:val="26"/>
       <w:szCs w:val="26"/>
     </w:rPr>
@@ -624,7 +1570,7 @@
       <w:outlineLvl w:val="2"/>
     </w:pPr>
     <w:rPr>
-      <w:rFonts w:asciiTheme="majorHAnsi" w:eastAsiaTheme="majorEastAsia" w:hAnsiTheme="majorHAnsi" w:cstheme="majorBidi"/>
+      <w:rFonts w:asciiTheme="majorHAnsi" w:eastAsiaTheme="majorEastAsia" w:hAnsiTheme="majorHAnsi" w:cstheme="majorBidi" w:ascii="Arial" w:hAnsi="Arial"/>
       <w:b/>
       <w:bCs/>
       <w:color w:val="4F81BD" w:themeColor="accent1"/>

</xml_diff>